<commit_message>
Publish corrected fractional DTA workflow and teacher review package
</commit_message>
<xml_diff>
--- a/docs/DTA测算方法.docx
+++ b/docs/DTA测算方法.docx
@@ -204,183 +204,17 @@
             <w:rPr>
               <w:rFonts w:ascii="Cambria Math" w:hAnsi="Cambria Math"/>
             </w:rPr>
-            <m:t>=</m:t>
+            <m:t>∈</m:t>
           </m:r>
-          <m:d>
-            <m:dPr>
-              <m:begChr m:val="{"/>
-              <m:endChr m:val=""/>
-              <m:ctrlPr>
-                <w:rPr>
-                  <w:rFonts w:ascii="Cambria Math" w:hAnsi="Cambria Math"/>
-                </w:rPr>
-              </m:ctrlPr>
-            </m:dPr>
-            <m:e>
-              <m:m>
-                <m:mPr>
-                  <m:plcHide m:val="1"/>
-                  <m:mcs>
-                    <m:mc>
-                      <m:mcPr>
-                        <m:count m:val="2"/>
-                        <m:mcJc m:val="left"/>
-                      </m:mcPr>
-                    </m:mc>
-                  </m:mcs>
-                  <m:ctrlPr>
-                    <w:rPr>
-                      <w:rFonts w:ascii="Cambria Math" w:hAnsi="Cambria Math"/>
-                    </w:rPr>
-                  </m:ctrlPr>
-                </m:mPr>
-                <m:mr>
-                  <m:e>
-                    <m:r>
-                      <w:rPr>
-                        <w:rFonts w:ascii="Cambria Math" w:hAnsi="Cambria Math"/>
-                      </w:rPr>
-                      <m:t>1</m:t>
-                    </m:r>
-                    <m:r>
-                      <m:rPr>
-                        <m:sty m:val="p"/>
-                      </m:rPr>
-                      <w:rPr>
-                        <w:rFonts w:ascii="Cambria Math" w:hAnsi="Cambria Math"/>
-                      </w:rPr>
-                      <m:t>,</m:t>
-                    </m:r>
-                  </m:e>
-                  <m:e>
-                    <m:r>
-                      <m:rPr>
-                        <m:nor/>
-                      </m:rPr>
-                      <m:t>协定</m:t>
-                    </m:r>
-                    <m:r>
-                      <m:rPr>
-                        <m:nor/>
-                      </m:rPr>
-                      <m:t xml:space="preserve"> </m:t>
-                    </m:r>
-                    <m:r>
-                      <w:rPr>
-                        <w:rFonts w:ascii="Cambria Math" w:hAnsi="Cambria Math"/>
-                      </w:rPr>
-                      <m:t>a</m:t>
-                    </m:r>
-                    <m:r>
-                      <m:rPr>
-                        <m:nor/>
-                      </m:rPr>
-                      <m:t xml:space="preserve"> </m:t>
-                    </m:r>
-                    <m:r>
-                      <m:rPr>
-                        <m:nor/>
-                      </m:rPr>
-                      <m:t>包含条款</m:t>
-                    </m:r>
-                    <m:r>
-                      <m:rPr>
-                        <m:nor/>
-                      </m:rPr>
-                      <m:t xml:space="preserve"> </m:t>
-                    </m:r>
-                    <m:r>
-                      <w:rPr>
-                        <w:rFonts w:ascii="Cambria Math" w:hAnsi="Cambria Math"/>
-                      </w:rPr>
-                      <m:t>k</m:t>
-                    </m:r>
-                    <m:r>
-                      <m:rPr>
-                        <m:sty m:val="p"/>
-                      </m:rPr>
-                      <w:rPr>
-                        <w:rFonts w:ascii="Cambria Math" w:hAnsi="Cambria Math"/>
-                      </w:rPr>
-                      <m:t>,</m:t>
-                    </m:r>
-                  </m:e>
-                </m:mr>
-                <m:mr>
-                  <m:e>
-                    <m:r>
-                      <w:rPr>
-                        <w:rFonts w:ascii="Cambria Math" w:hAnsi="Cambria Math"/>
-                      </w:rPr>
-                      <m:t>0</m:t>
-                    </m:r>
-                    <m:r>
-                      <m:rPr>
-                        <m:sty m:val="p"/>
-                      </m:rPr>
-                      <w:rPr>
-                        <w:rFonts w:ascii="Cambria Math" w:hAnsi="Cambria Math"/>
-                      </w:rPr>
-                      <m:t>,</m:t>
-                    </m:r>
-                  </m:e>
-                  <m:e>
-                    <m:r>
-                      <m:rPr>
-                        <m:nor/>
-                      </m:rPr>
-                      <m:t>协定</m:t>
-                    </m:r>
-                    <m:r>
-                      <m:rPr>
-                        <m:nor/>
-                      </m:rPr>
-                      <m:t xml:space="preserve"> </m:t>
-                    </m:r>
-                    <m:r>
-                      <w:rPr>
-                        <w:rFonts w:ascii="Cambria Math" w:hAnsi="Cambria Math"/>
-                      </w:rPr>
-                      <m:t>a</m:t>
-                    </m:r>
-                    <m:r>
-                      <m:rPr>
-                        <m:nor/>
-                      </m:rPr>
-                      <m:t xml:space="preserve"> </m:t>
-                    </m:r>
-                    <m:r>
-                      <m:rPr>
-                        <m:nor/>
-                      </m:rPr>
-                      <m:t>不包含条款</m:t>
-                    </m:r>
-                    <m:r>
-                      <m:rPr>
-                        <m:nor/>
-                      </m:rPr>
-                      <m:t xml:space="preserve"> </m:t>
-                    </m:r>
-                    <m:r>
-                      <w:rPr>
-                        <w:rFonts w:ascii="Cambria Math" w:hAnsi="Cambria Math"/>
-                      </w:rPr>
-                      <m:t>k</m:t>
-                    </m:r>
-                    <m:r>
-                      <m:rPr>
-                        <m:sty m:val="p"/>
-                      </m:rPr>
-                      <w:rPr>
-                        <w:rFonts w:ascii="Cambria Math" w:hAnsi="Cambria Math"/>
-                      </w:rPr>
-                      <m:t>.</m:t>
-                    </m:r>
-                  </m:e>
-                </m:mr>
-              </m:m>
-            </m:e>
-          </m:d>
+          <m:r>
+            <m:rPr>
+              <m:sty m:val="p"/>
+            </m:rPr>
+            <w:rPr>
+              <w:rFonts w:ascii="Cambria Math" w:hAnsi="Cambria Math"/>
+            </w:rPr>
+            <m:t>[0,1]</m:t>
+          </m:r>
           <m:r>
             <w:rPr>
               <w:rFonts w:ascii="Cambria Math" w:hAnsi="Cambria Math"/>
@@ -479,19 +313,19 @@
         </m:r>
       </m:oMath>
       <w:r>
-        <w:t>，以保留原始数据库可能存在的部分覆盖信息；当前数据版本中的实际取值均为</w:t>
+        <w:t>，保留编码后条款的部分覆盖信息；当前数据实际包含</w:t>
       </w:r>
       <w:r>
         <w:t xml:space="preserve"> 0 </w:t>
       </w:r>
       <w:r>
-        <w:t>或</w:t>
-      </w:r>
-      <w:r>
-        <w:t xml:space="preserve"> 1</w:t>
-      </w:r>
-      <w:r>
-        <w:t>。所有条款均获得唯一且稳定的条款编号；进入测算前，程序检查覆盖值是否位于合法区间、条款与协定编号是否唯一，以及双边记录中的协定编号和年份是否缺失。</w:t>
+        <w:t>、</w:t>
+      </w:r>
+      <w:r>
+        <w:t xml:space="preserve"> 1 及二者之间的部分覆盖值</w:t>
+      </w:r>
+      <w:r>
+        <w:t>。其中 1 表示完全覆盖，介于 0 与 1 之间的取值表示部分覆盖，0 表示不覆盖或覆盖值为空白；该规则仅适用于 DTA 条款覆盖值，不适用于回归控制变量的缺失值。所有条款均获得唯一且稳定的条款编号；进入测算前，程序检查覆盖值是否位于合法区间、条款与协定编号是否唯一，以及双边记录中的协定编号和年份是否缺失。</w:t>
       </w:r>
     </w:p>
     <w:p>

</xml_diff>